<commit_message>
Put copy selection guidance before setup
Co-authored-by: Copilot <223556219+Copilot@users.noreply.github.com>
</commit_message>
<xml_diff>
--- a/Return Visits App Privacy & Data Notice.docx
+++ b/Return Visits App Privacy & Data Notice.docx
@@ -27,6 +27,12 @@
       </w:pPr>
       <w:r>
         <w:t>At a glance</w:t>
+      </w:r>
+    </w:p>
+    <w:p>
+      <w:pPr/>
+      <w:r>
+        <w:t>Before adding contacts, choose one browser or Home Screen app on one device for regular use. These copies may store separate data and do not automatically sync; adding a Home Screen icon does not transfer browser contacts. To switch, export an encrypted backup from the version with your data and restore it in the other version.</w:t>
       </w:r>
     </w:p>
     <w:p>

</xml_diff>